<commit_message>
docs(HCO v2): MOM disclaimer fix, SOP policy titles, record document control
</commit_message>
<xml_diff>
--- a/policies/build/chapters_v2/MOM/Document/MOM_Package/MOM1/Records/MOM.1_Record_01_medication_management_manual_coverage_checklist.docx
+++ b/policies/build/chapters_v2/MOM/Document/MOM_Package/MOM1/Records/MOM.1_Record_01_medication_management_manual_coverage_checklist.docx
@@ -31,6 +31,110 @@
         <w:t xml:space="preserve">MOM.1 Record 1 — Medication Management Manual Coverage Checklist</w:t>
       </w:r>
     </w:p>
+    <w:tbl>
+      <w:tblPr>
+        <w:tblW w:type="auto" w:w="0"/>
+        <w:tblLook w:firstColumn="1" w:firstRow="1" w:lastColumn="0" w:lastRow="0" w:noHBand="0" w:noVBand="1" w:val="04A0"/>
+        <w:tblBorders>
+          <w:top w:val="single" w:sz="4" w:space="0" w:color="000000"/>
+          <w:left w:val="single" w:sz="4" w:space="0" w:color="000000"/>
+          <w:bottom w:val="single" w:sz="4" w:space="0" w:color="000000"/>
+          <w:right w:val="single" w:sz="4" w:space="0" w:color="000000"/>
+          <w:insideH w:val="single" w:sz="4" w:space="0" w:color="000000"/>
+          <w:insideV w:val="single" w:sz="4" w:space="0" w:color="000000"/>
+        </w:tblBorders>
+      </w:tblPr>
+      <w:tblGrid>
+        <w:gridCol w:w="2340"/>
+        <w:gridCol w:w="2340"/>
+        <w:gridCol w:w="2340"/>
+        <w:gridCol w:w="2340"/>
+      </w:tblGrid>
+      <w:tr>
+        <w:tc>
+          <w:tcPr>
+            <w:tcW w:type="dxa" w:w="2340"/>
+          </w:tcPr>
+          <w:p>
+            <w:r>
+              <w:t>Document No.</w:t>
+            </w:r>
+          </w:p>
+        </w:tc>
+        <w:tc>
+          <w:tcPr>
+            <w:tcW w:type="dxa" w:w="2340"/>
+          </w:tcPr>
+          <w:p>
+            <w:r>
+              <w:t>[Hospital to define]</w:t>
+            </w:r>
+          </w:p>
+        </w:tc>
+        <w:tc>
+          <w:tcPr>
+            <w:tcW w:type="dxa" w:w="2340"/>
+          </w:tcPr>
+          <w:p>
+            <w:r>
+              <w:t>Version</w:t>
+            </w:r>
+          </w:p>
+        </w:tc>
+        <w:tc>
+          <w:tcPr>
+            <w:tcW w:type="dxa" w:w="2340"/>
+          </w:tcPr>
+          <w:p>
+            <w:r>
+              <w:t>1.0</w:t>
+            </w:r>
+          </w:p>
+        </w:tc>
+      </w:tr>
+      <w:tr>
+        <w:tc>
+          <w:tcPr>
+            <w:tcW w:type="dxa" w:w="2340"/>
+          </w:tcPr>
+          <w:p>
+            <w:r>
+              <w:t>Effective Date</w:t>
+            </w:r>
+          </w:p>
+        </w:tc>
+        <w:tc>
+          <w:tcPr>
+            <w:tcW w:type="dxa" w:w="2340"/>
+          </w:tcPr>
+          <w:p>
+            <w:r>
+              <w:t>________</w:t>
+            </w:r>
+          </w:p>
+        </w:tc>
+        <w:tc>
+          <w:tcPr>
+            <w:tcW w:type="dxa" w:w="2340"/>
+          </w:tcPr>
+          <w:p>
+            <w:r>
+              <w:t>Review Frequency</w:t>
+            </w:r>
+          </w:p>
+        </w:tc>
+        <w:tc>
+          <w:tcPr>
+            <w:tcW w:type="dxa" w:w="2340"/>
+          </w:tcPr>
+          <w:p>
+            <w:r>
+              <w:t>Per parent SOP/Policy</w:t>
+            </w:r>
+          </w:p>
+        </w:tc>
+      </w:tr>
+    </w:tbl>
     <w:p>
       <w:pPr>
         <w:spacing w:after="150"/>

</xml_diff>